<commit_message>
Projektgeschichte um Arbeit und Schichtalltag ergänzen
</commit_message>
<xml_diff>
--- a/docs/KR_Compiler_Android_Kreta_Geschichte_v3.1_15-10-2026.docx
+++ b/docs/KR_Compiler_Android_Kreta_Geschichte_v3.1_15-10-2026.docx
@@ -96,6 +96,32 @@
     <w:p>
       <w:r>
         <w:t>Aus dieser Frage wurde kein Businessplan, sondern ein Entwicklungsprojekt: KR Compiler Android.</w:t>
+      </w:r>
+    </w:p>
+    <w:p>
+      <w:pPr>
+        <w:pStyle w:val="Heading1"/>
+      </w:pPr>
+      <w:r>
+        <w:t>Die eigentliche Entwicklungszeit beginnt nach der Schicht.</w:t>
+      </w:r>
+    </w:p>
+    <w:p>
+      <w:pPr/>
+      <w:r>
+        <w:t>Im Alltag arbeite ich regulär bei der E-Post. Acht Stunden Arbeit, ungefähr eine Stunde Hinfahrt und eine Stunde Rückfahrt: Mit den Wartezeiten auf die Bahn ist ein Tag schnell zehn bis zwölf Stunden lang. Und das Ganze im Drei-Schicht-System.</w:t>
+      </w:r>
+    </w:p>
+    <w:p>
+      <w:pPr/>
+      <w:r>
+        <w:t>Programmiert wird trotzdem - nach der Früh-, Spät- oder Nachtschicht, privat und ohne Auftraggeber. Wenn andere längst Feierabend haben, beginnt für mich oft erst die Arbeit am KR Compiler. Klingt ein bisschen verrückt? Ist es wahrscheinlich auch.</w:t>
+      </w:r>
+    </w:p>
+    <w:p>
+      <w:pPr/>
+      <w:r>
+        <w:t>Und ehrlich gesagt entstand das Projekt aus Eigennutz. Ich baue den KR Compiler, weil ich selbst ein Werkzeug brauche, mit dem ich C++-Projekte auf dem Smartphone bearbeiten und für mehrere Systeme bauen kann. Wenn es dabei auch anderen hilft, umso besser.</w:t>
       </w:r>
     </w:p>
     <w:p>

</xml_diff>